<commit_message>
chore: add a grouped pair of shapes to the native-objects fixture
</commit_message>
<xml_diff>
--- a/tests/fixtures/pages/reference/native-objects.docx
+++ b/tests/fixtures/pages/reference/native-objects.docx
@@ -23,21 +23,21 @@
         <w:rPr>
           <w:rtl w:val="0"/>
         </w:rPr>
-        <w:t>Shapes, a line, an</w:t>
+        <w:t>A group, a shape, a l</w:t>
       </w:r>
       <w:r>
         <mc:AlternateContent>
-          <mc:Choice Requires="wps">
+          <mc:Choice Requires="wpg">
             <w:drawing xmlns:a="http://schemas.openxmlformats.org/drawingml/2006/main">
               <wp:anchor distT="152400" distB="152400" distL="152400" distR="152400" simplePos="0" relativeHeight="251659264" behindDoc="0" locked="0" layoutInCell="1" allowOverlap="1">
                 <wp:simplePos x="0" y="0"/>
                 <wp:positionH relativeFrom="page">
-                  <wp:posOffset>914399</wp:posOffset>
+                  <wp:posOffset>914400</wp:posOffset>
                 </wp:positionH>
                 <wp:positionV relativeFrom="page">
-                  <wp:posOffset>1778000</wp:posOffset>
+                  <wp:posOffset>1651000</wp:posOffset>
                 </wp:positionV>
-                <wp:extent cx="2794000" cy="1397000"/>
+                <wp:extent cx="3276600" cy="1016000"/>
                 <wp:effectExtent l="0" t="0" r="0" b="0"/>
                 <wp:wrapThrough wrapText="bothSides" distL="152400" distR="152400">
                   <wp:wrapPolygon edited="1">
@@ -48,7 +48,179 @@
                     <wp:lineTo x="0" y="0"/>
                   </wp:wrapPolygon>
                 </wp:wrapThrough>
-                <wp:docPr id="1073741825" name="officeArt object" descr="A shape with text."/>
+                <wp:docPr id="1073741827" name="officeArt object" descr="Group"/>
+                <wp:cNvGraphicFramePr/>
+                <a:graphic xmlns:a="http://schemas.openxmlformats.org/drawingml/2006/main">
+                  <a:graphicData uri="http://schemas.microsoft.com/office/word/2010/wordprocessingGroup">
+                    <wpg:wgp>
+                      <wpg:cNvGrpSpPr/>
+                      <wpg:grpSpPr>
+                        <a:xfrm>
+                          <a:off x="0" y="0"/>
+                          <a:ext cx="3276600" cy="1016000"/>
+                          <a:chOff x="0" y="0"/>
+                          <a:chExt cx="3276600" cy="1016000"/>
+                        </a:xfrm>
+                      </wpg:grpSpPr>
+                      <wps:wsp>
+                        <wps:cNvPr id="1073741825" name="Group A"/>
+                        <wps:cNvSpPr/>
+                        <wps:spPr>
+                          <a:xfrm>
+                            <a:off x="0" y="0"/>
+                            <a:ext cx="1397000" cy="1016000"/>
+                          </a:xfrm>
+                          <a:prstGeom prst="rect">
+                            <a:avLst/>
+                          </a:prstGeom>
+                          <a:solidFill>
+                            <a:srgbClr val="000000"/>
+                          </a:solidFill>
+                          <a:ln w="12700" cap="flat">
+                            <a:noFill/>
+                            <a:miter lim="400000"/>
+                          </a:ln>
+                          <a:effectLst/>
+                        </wps:spPr>
+                        <wps:txbx>
+                          <w:txbxContent>
+                            <w:p>
+                              <w:pPr>
+                                <w:pStyle w:val="Label"/>
+                                <w:bidi w:val="0"/>
+                              </w:pPr>
+                              <w:r>
+                                <w:rPr>
+                                  <w:rtl w:val="0"/>
+                                </w:rPr>
+                                <w:t>Group A</w:t>
+                              </w:r>
+                            </w:p>
+                          </w:txbxContent>
+                        </wps:txbx>
+                        <wps:bodyPr wrap="square" lIns="50800" tIns="50800" rIns="50800" bIns="50800" numCol="1" anchor="ctr">
+                          <a:noAutofit/>
+                        </wps:bodyPr>
+                      </wps:wsp>
+                      <wps:wsp>
+                        <wps:cNvPr id="1073741826" name="Group B"/>
+                        <wps:cNvSpPr/>
+                        <wps:spPr>
+                          <a:xfrm>
+                            <a:off x="1879600" y="0"/>
+                            <a:ext cx="1397000" cy="1016000"/>
+                          </a:xfrm>
+                          <a:prstGeom prst="rect">
+                            <a:avLst/>
+                          </a:prstGeom>
+                          <a:solidFill>
+                            <a:srgbClr val="000000"/>
+                          </a:solidFill>
+                          <a:ln w="12700" cap="flat">
+                            <a:noFill/>
+                            <a:miter lim="400000"/>
+                          </a:ln>
+                          <a:effectLst/>
+                        </wps:spPr>
+                        <wps:txbx>
+                          <w:txbxContent>
+                            <w:p>
+                              <w:pPr>
+                                <w:pStyle w:val="Label"/>
+                                <w:bidi w:val="0"/>
+                              </w:pPr>
+                              <w:r>
+                                <w:rPr>
+                                  <w:rtl w:val="0"/>
+                                </w:rPr>
+                                <w:t>Group B</w:t>
+                              </w:r>
+                            </w:p>
+                          </w:txbxContent>
+                        </wps:txbx>
+                        <wps:bodyPr wrap="square" lIns="50800" tIns="50800" rIns="50800" bIns="50800" numCol="1" anchor="ctr">
+                          <a:noAutofit/>
+                        </wps:bodyPr>
+                      </wps:wsp>
+                    </wpg:wgp>
+                  </a:graphicData>
+                </a:graphic>
+              </wp:anchor>
+            </w:drawing>
+          </mc:Choice>
+          <mc:Fallback>
+            <w:pict>
+              <v:group id="_x0000_s1026" style="visibility:visible;position:absolute;margin-left:72.0pt;margin-top:130.0pt;width:258.0pt;height:80.0pt;z-index:251659264;mso-position-horizontal:absolute;mso-position-horizontal-relative:page;mso-position-vertical:absolute;mso-position-vertical-relative:page;mso-wrap-distance-left:12.0pt;mso-wrap-distance-top:12.0pt;mso-wrap-distance-right:12.0pt;mso-wrap-distance-bottom:12.0pt;" coordorigin="0,0" coordsize="3276600,1016000">
+                <w10:wrap type="through" side="bothSides" anchorx="page" anchory="page"/>
+                <v:rect id="_x0000_s1027" style="position:absolute;left:0;top:0;width:1397000;height:1016000;">
+                  <v:fill color="#000000" opacity="100.0%" type="solid"/>
+                  <v:stroke on="f" weight="1.0pt" dashstyle="solid" endcap="flat" miterlimit="400.0%" joinstyle="miter" linestyle="single" startarrow="none" startarrowwidth="medium" startarrowlength="medium" endarrow="none" endarrowwidth="medium" endarrowlength="medium"/>
+                  <v:textbox>
+                    <w:txbxContent>
+                      <w:p>
+                        <w:pPr>
+                          <w:pStyle w:val="Label"/>
+                          <w:bidi w:val="0"/>
+                        </w:pPr>
+                        <w:r>
+                          <w:rPr>
+                            <w:rtl w:val="0"/>
+                          </w:rPr>
+                          <w:t>Group A</w:t>
+                        </w:r>
+                      </w:p>
+                    </w:txbxContent>
+                  </v:textbox>
+                </v:rect>
+                <v:rect id="_x0000_s1028" style="position:absolute;left:1879600;top:0;width:1397000;height:1016000;">
+                  <v:fill color="#000000" opacity="100.0%" type="solid"/>
+                  <v:stroke on="f" weight="1.0pt" dashstyle="solid" endcap="flat" miterlimit="400.0%" joinstyle="miter" linestyle="single" startarrow="none" startarrowwidth="medium" startarrowlength="medium" endarrow="none" endarrowwidth="medium" endarrowlength="medium"/>
+                  <v:textbox>
+                    <w:txbxContent>
+                      <w:p>
+                        <w:pPr>
+                          <w:pStyle w:val="Label"/>
+                          <w:bidi w:val="0"/>
+                        </w:pPr>
+                        <w:r>
+                          <w:rPr>
+                            <w:rtl w:val="0"/>
+                          </w:rPr>
+                          <w:t>Group B</w:t>
+                        </w:r>
+                      </w:p>
+                    </w:txbxContent>
+                  </v:textbox>
+                </v:rect>
+              </v:group>
+            </w:pict>
+          </mc:Fallback>
+        </mc:AlternateContent>
+      </w:r>
+      <w:r>
+        <mc:AlternateContent>
+          <mc:Choice Requires="wps">
+            <w:drawing xmlns:a="http://schemas.openxmlformats.org/drawingml/2006/main">
+              <wp:anchor distT="152400" distB="152400" distL="152400" distR="152400" simplePos="0" relativeHeight="251660288" behindDoc="0" locked="0" layoutInCell="1" allowOverlap="1">
+                <wp:simplePos x="0" y="0"/>
+                <wp:positionH relativeFrom="page">
+                  <wp:posOffset>914399</wp:posOffset>
+                </wp:positionH>
+                <wp:positionV relativeFrom="page">
+                  <wp:posOffset>3302000</wp:posOffset>
+                </wp:positionV>
+                <wp:extent cx="2794000" cy="1143000"/>
+                <wp:effectExtent l="0" t="0" r="0" b="0"/>
+                <wp:wrapThrough wrapText="bothSides" distL="152400" distR="152400">
+                  <wp:wrapPolygon edited="1">
+                    <wp:start x="0" y="0"/>
+                    <wp:lineTo x="21600" y="0"/>
+                    <wp:lineTo x="21600" y="21600"/>
+                    <wp:lineTo x="0" y="21600"/>
+                    <wp:lineTo x="0" y="0"/>
+                  </wp:wrapPolygon>
+                </wp:wrapThrough>
+                <wp:docPr id="1073741828" name="officeArt object" descr="A lone shape with text."/>
                 <wp:cNvGraphicFramePr/>
                 <a:graphic xmlns:a="http://schemas.openxmlformats.org/drawingml/2006/main">
                   <a:graphicData uri="http://schemas.microsoft.com/office/word/2010/wordprocessingShape">
@@ -57,7 +229,7 @@
                       <wps:spPr>
                         <a:xfrm>
                           <a:off x="0" y="0"/>
-                          <a:ext cx="2794000" cy="1397000"/>
+                          <a:ext cx="2794000" cy="1143000"/>
                         </a:xfrm>
                         <a:prstGeom prst="rect">
                           <a:avLst/>
@@ -82,7 +254,7 @@
                               <w:rPr>
                                 <w:rtl w:val="0"/>
                               </w:rPr>
-                              <w:t>A shape with text.</w:t>
+                              <w:t>A lone shape with text.</w:t>
                             </w:r>
                           </w:p>
                         </w:txbxContent>
@@ -98,7 +270,7 @@
           </mc:Choice>
           <mc:Fallback>
             <w:pict>
-              <v:rect id="_x0000_s1026" style="visibility:visible;position:absolute;margin-left:72.0pt;margin-top:140.0pt;width:220.0pt;height:110.0pt;z-index:251659264;mso-position-horizontal:absolute;mso-position-horizontal-relative:page;mso-position-vertical:absolute;mso-position-vertical-relative:page;mso-wrap-distance-left:12.0pt;mso-wrap-distance-top:12.0pt;mso-wrap-distance-right:12.0pt;mso-wrap-distance-bottom:12.0pt;">
+              <v:rect id="_x0000_s1029" style="visibility:visible;position:absolute;margin-left:72.0pt;margin-top:260.0pt;width:220.0pt;height:90.0pt;z-index:251660288;mso-position-horizontal:absolute;mso-position-horizontal-relative:page;mso-position-vertical:absolute;mso-position-vertical-relative:page;mso-wrap-distance-left:12.0pt;mso-wrap-distance-top:12.0pt;mso-wrap-distance-right:12.0pt;mso-wrap-distance-bottom:12.0pt;">
                 <v:fill color="#000000" opacity="100.0%" type="solid"/>
                 <v:stroke on="f" weight="1.0pt" dashstyle="solid" endcap="flat" miterlimit="400.0%" joinstyle="miter" linestyle="single" startarrow="none" startarrowwidth="medium" startarrowlength="medium" endarrow="none" endarrowwidth="medium" endarrowlength="medium"/>
                 <v:textbox>
@@ -112,7 +284,7 @@
                         <w:rPr>
                           <w:rtl w:val="0"/>
                         </w:rPr>
-                        <w:t>A shape with text.</w:t>
+                        <w:t>A lone shape with text.</w:t>
                       </w:r>
                     </w:p>
                   </w:txbxContent>
@@ -127,13 +299,13 @@
         <mc:AlternateContent>
           <mc:Choice Requires="wps">
             <w:drawing xmlns:a="http://schemas.openxmlformats.org/drawingml/2006/main">
-              <wp:anchor distT="152400" distB="152400" distL="152400" distR="152400" simplePos="0" relativeHeight="251660288" behindDoc="0" locked="0" layoutInCell="1" allowOverlap="1">
+              <wp:anchor distT="152400" distB="152400" distL="152400" distR="152400" simplePos="0" relativeHeight="251661312" behindDoc="0" locked="0" layoutInCell="1" allowOverlap="1">
                 <wp:simplePos x="0" y="0"/>
                 <wp:positionH relativeFrom="page">
-                  <wp:posOffset>914399</wp:posOffset>
+                  <wp:posOffset>914400</wp:posOffset>
                 </wp:positionH>
                 <wp:positionV relativeFrom="page">
-                  <wp:posOffset>3810000</wp:posOffset>
+                  <wp:posOffset>4826000</wp:posOffset>
                 </wp:positionV>
                 <wp:extent cx="4165600" cy="0"/>
                 <wp:effectExtent l="0" t="0" r="0" b="0"/>
@@ -144,7 +316,7 @@
                     <wp:lineTo x="0" y="0"/>
                   </wp:wrapPolygon>
                 </wp:wrapThrough>
-                <wp:docPr id="1073741826" name="officeArt object" descr="Line"/>
+                <wp:docPr id="1073741829" name="officeArt object" descr="Line"/>
                 <wp:cNvGraphicFramePr/>
                 <a:graphic xmlns:a="http://schemas.openxmlformats.org/drawingml/2006/main">
                   <a:graphicData uri="http://schemas.microsoft.com/office/word/2010/wordprocessingShape">
@@ -177,7 +349,7 @@
           </mc:Choice>
           <mc:Fallback>
             <w:pict>
-              <v:line id="_x0000_s1027" style="visibility:visible;position:absolute;margin-left:72.0pt;margin-top:300.0pt;width:328.0pt;height:0.0pt;z-index:251660288;mso-position-horizontal:absolute;mso-position-horizontal-relative:page;mso-position-vertical:absolute;mso-position-vertical-relative:page;mso-wrap-distance-left:12.0pt;mso-wrap-distance-top:12.0pt;mso-wrap-distance-right:12.0pt;mso-wrap-distance-bottom:12.0pt;">
+              <v:line id="_x0000_s1030" style="visibility:visible;position:absolute;margin-left:72.0pt;margin-top:380.0pt;width:328.0pt;height:0.0pt;z-index:251661312;mso-position-horizontal:absolute;mso-position-horizontal-relative:page;mso-position-vertical:absolute;mso-position-vertical-relative:page;mso-wrap-distance-left:12.0pt;mso-wrap-distance-top:12.0pt;mso-wrap-distance-right:12.0pt;mso-wrap-distance-bottom:12.0pt;">
                 <v:fill on="f"/>
                 <v:stroke filltype="solid" color="#000000" opacity="100.0%" weight="2.0pt" dashstyle="solid" endcap="flat" miterlimit="400.0%" joinstyle="miter" linestyle="single" startarrow="none" startarrowwidth="medium" startarrowlength="medium" endarrow="none" endarrowwidth="medium" endarrowlength="medium"/>
                 <w10:wrap type="through" side="bothSides" anchorx="page" anchory="page"/>
@@ -188,18 +360,18 @@
       </w:r>
       <w:r>
         <w:drawing xmlns:a="http://schemas.openxmlformats.org/drawingml/2006/main">
-          <wp:anchor distT="152400" distB="152400" distL="152400" distR="152400" simplePos="0" relativeHeight="251661312" behindDoc="0" locked="0" layoutInCell="1" allowOverlap="1">
+          <wp:anchor distT="152400" distB="152400" distL="152400" distR="152400" simplePos="0" relativeHeight="251662336" behindDoc="0" locked="0" layoutInCell="1" allowOverlap="1">
             <wp:simplePos x="0" y="0"/>
             <wp:positionH relativeFrom="page">
               <wp:posOffset>552386</wp:posOffset>
             </wp:positionH>
             <wp:positionV relativeFrom="page">
-              <wp:posOffset>4100779</wp:posOffset>
+              <wp:posOffset>4989779</wp:posOffset>
             </wp:positionV>
             <wp:extent cx="5080000" cy="3810000"/>
             <wp:effectExtent l="0" t="0" r="0" b="0"/>
             <wp:wrapSquare wrapText="bothSides" distL="152400" distR="152400" distT="152400" distB="152400"/>
-            <wp:docPr id="1073741827" name="officeArt object"/>
+            <wp:docPr id="1073741830" name="officeArt object"/>
             <wp:cNvGraphicFramePr/>
             <a:graphic xmlns:a="http://schemas.openxmlformats.org/drawingml/2006/main">
               <a:graphicData uri="http://schemas.openxmlformats.org/drawingml/2006/chart">
@@ -213,7 +385,7 @@
         <w:rPr>
           <w:rtl w:val="0"/>
         </w:rPr>
-        <w:t>d a chart, each authored by AppleScript.</w:t>
+        <w:t>ine, and a chart, authored by AppleScript.</w:t>
       </w:r>
     </w:p>
     <w:sectPr>

</xml_diff>